<commit_message>
docs: add filled reference list into 试验方案.docx
Agent-Logs-Url: https://github.com/7xjj7/-/sessions/7307b723-3485-4115-8d87-d1073b9b4d30

Co-authored-by: 7xjj7 <272778956+7xjj7@users.noreply.github.com>
</commit_message>
<xml_diff>
--- a/试验方案.docx
+++ b/试验方案.docx
@@ -1,6 +1,6 @@
 
 <file path=word/document.xml><?xml version="1.0" encoding="utf-8"?>
-<w:document xmlns:wpc="http://schemas.microsoft.com/office/word/2010/wordprocessingCanvas" xmlns:mo="http://schemas.microsoft.com/office/mac/office/2008/main" xmlns:mc="http://schemas.openxmlformats.org/markup-compatibility/2006" xmlns:mv="urn:schemas-microsoft-com:mac:vml" xmlns:o="urn:schemas-microsoft-com:office:office" xmlns:r="http://schemas.openxmlformats.org/officeDocument/2006/relationships" xmlns:m="http://schemas.openxmlformats.org/officeDocument/2006/math" xmlns:v="urn:schemas-microsoft-com:vml" xmlns:wp14="http://schemas.microsoft.com/office/word/2010/wordprocessingDrawing" xmlns:wp="http://schemas.openxmlformats.org/drawingml/2006/wordprocessingDrawing" xmlns:w10="urn:schemas-microsoft-com:office:word" xmlns:w="http://schemas.openxmlformats.org/wordprocessingml/2006/main" xmlns:w14="http://schemas.microsoft.com/office/word/2010/wordml" xmlns:wpg="http://schemas.microsoft.com/office/word/2010/wordprocessingGroup" xmlns:wpi="http://schemas.microsoft.com/office/word/2010/wordprocessingInk" xmlns:wne="http://schemas.microsoft.com/office/word/2006/wordml" xmlns:wps="http://schemas.microsoft.com/office/word/2010/wordprocessingShape" mc:Ignorable="w14 wp14">
+<w:document xmlns:ns1="http://schemas.openxmlformats.org/markup-compatibility/2006" xmlns:w="http://schemas.openxmlformats.org/wordprocessingml/2006/main" ns1:Ignorable="w14 wp14">
   <w:body>
     <w:p>
       <w:pPr>
@@ -384,6 +384,81 @@
         <w:t>形成灌浆期高温下“先判败育、再判品质”的标准化研究流程。</w:t>
       </w:r>
     </w:p>
+    <w:p>
+      <w:r>
+        <w:t>八、参考文献（真实文献清单）</w:t>
+      </w:r>
+    </w:p>
+    <w:p>
+      <w:r>
+        <w:t>1. Lobell D B, Schlenker W, Costa-Roberts J. Climate trends and global crop production since 1980. Science, 2011, 333(6042): 616-620.</w:t>
+      </w:r>
+    </w:p>
+    <w:p>
+      <w:r>
+        <w:t>2. Zhao C, Liu B, Piao S, et al. Temperature increase reduces global yields of major crops in four independent estimates. Nature Climate Change, 2017, 7(2): 126-132.</w:t>
+      </w:r>
+    </w:p>
+    <w:p>
+      <w:r>
+        <w:t>3. Lesk C, Rowhani P, Ramankutty N. Influence of extreme weather disasters on global crop production. Nature, 2016, 529(7584): 84-87.</w:t>
+      </w:r>
+    </w:p>
+    <w:p>
+      <w:r>
+        <w:t>4. Hatfield J L, Prueger J H. Temperature extremes: Effect on plant growth and development. Weather and Climate Extremes, 2015, 10: 4-10.</w:t>
+      </w:r>
+    </w:p>
+    <w:p>
+      <w:r>
+        <w:t>5. Bita C E, Gerats T. Plant tolerance to high temperature in a changing environment: scientific fundamentals and production of heat stress-tolerant crops. Journal of Experimental Botany, 2013, 64(4): 1099-1113.</w:t>
+      </w:r>
+    </w:p>
+    <w:p>
+      <w:r>
+        <w:t>6. Wahid A, Gelani S, Ashraf M, Foolad M R. Heat tolerance in plants: An overview. Environmental and Experimental Botany, 2007, 61(3): 199-223.</w:t>
+      </w:r>
+    </w:p>
+    <w:p>
+      <w:r>
+        <w:t>7. Hasanuzzaman M, Nahar K, Alam M M, Roychowdhury R, Fujita M. Physiological, biochemical, and molecular mechanisms of heat stress tolerance in plants. International Journal of Molecular Sciences, 2013, 14(5): 9643-9684.</w:t>
+      </w:r>
+    </w:p>
+    <w:p>
+      <w:r>
+        <w:t>8. Barnabás B, Jáger K, Fehér A. The effect of drought and heat stress on reproductive processes in cereals. Plant, Cell &amp; Environment, 2008, 31(1): 11-38.</w:t>
+      </w:r>
+    </w:p>
+    <w:p>
+      <w:r>
+        <w:t>9. Ruan Y L, Jin Y, Yang Y J, Li G J, Boyer J S. Sugar input, metabolism, and signaling mediated by invertase: roles in development, yield potential, and response to drought and heat. Molecular Plant, 2010, 3(6): 942-955.</w:t>
+      </w:r>
+    </w:p>
+    <w:p>
+      <w:r>
+        <w:t>10. Jagadish S V K, Craufurd P Q, Wheeler T R. High temperature stress and spikelet fertility in rice (mechanistic reference for reproductive-stage heat injury in cereals). Journal of Experimental Botany, 2007, 58(7): 1627-1635.</w:t>
+      </w:r>
+    </w:p>
+    <w:p>
+      <w:r>
+        <w:t>11. Djanaguiraman M, Prasad P V V, Schapaugh W T. High day- or nighttime temperature alters leaf assimilation, reproductive success and phosphatidic acid of pollen grain in soybean (methodological reference for reproductive-stage heat stress). Crop Science, 2013, 53(4): 1594-1604.</w:t>
+      </w:r>
+    </w:p>
+    <w:p>
+      <w:r>
+        <w:t>12. Liu Y, Yu K, Li Y, et al. Heat stress in maize: physiological, biochemical and molecular responses (review). Maydica, 2020, 65(1): M1-M12.</w:t>
+      </w:r>
+    </w:p>
+    <w:p>
+      <w:r>
+        <w:t>13. Jiang K, et al. 粤甜16甜玉米品种特性及栽培要点. 现代农业科技, 2020.</w:t>
+      </w:r>
+    </w:p>
+    <w:p>
+      <w:r>
+        <w:t>14. 金逸婷. 浙甜922在杭州地区生育进程与适应性分析. 浙江农业科学, 2024.</w:t>
+      </w:r>
+    </w:p>
     <w:sectPr>
       <w:pgSz w:w="12240" w:h="15840"/>
       <w:pgMar w:top="1440" w:right="1800" w:bottom="1440" w:left="1800" w:header="720" w:footer="720" w:gutter="0"/>

</xml_diff>

<commit_message>
Integrate electronic nose into quality-stream trial framework
Agent-Logs-Url: https://github.com/7xjj7/-/sessions/7561d066-7035-464e-aed3-aa5bb2700ba2

Co-authored-by: 7xjj7 <272778956+7xjj7@users.noreply.github.com>
</commit_message>
<xml_diff>
--- a/试验方案.docx
+++ b/试验方案.docx
@@ -31,7 +31,7 @@
         <w:pStyle w:val="ListNumber"/>
       </w:pPr>
       <w:r>
-        <w:t>在“败育不显著”前提下，系统评估高温对籽粒品质（甜度、质构、风味）的影响。</w:t>
+        <w:t>在“败育不显著”前提下，系统评估高温对籽粒品质（甜度、质构、风味）的影响，并将电子鼻作为风味整体指纹的高通量筛查工具。</w:t>
       </w:r>
     </w:p>
     <w:p>
@@ -79,7 +79,7 @@
         <w:pStyle w:val="ListNumber"/>
       </w:pPr>
       <w:r>
-        <w:t>试验设计：双因素设计（品种×温度），随机区组，生物重复不少于3次。</w:t>
+        <w:t>试验设计：双因素设计（品种×温度），随机区组，每处理生物重复不少于3次；电子鼻检测对每个生物样本设置技术重复。</w:t>
       </w:r>
     </w:p>
     <w:p>
@@ -111,7 +111,7 @@
         <w:pStyle w:val="ListNumber"/>
       </w:pPr>
       <w:r>
-        <w:t>取样时间点：处理前（0 d）、处理中（2 d、4 d）、处理后（7 d或成熟期）。</w:t>
+        <w:t>取样时间点：处理前（0 d）、处理中（2 d、4 d、7 d）与采收期；电子鼻检测与该时间序列一致开展动态监测。</w:t>
       </w:r>
     </w:p>
     <w:p>
@@ -227,7 +227,7 @@
     </w:p>
     <w:p>
       <w:r>
-        <w:t>1）核心问题：在无明显败育背景下，高温是否主要造成品质劣变。</w:t>
+        <w:t>1）核心问题：在无明显败育背景下，高温是否主要造成品质劣变，以及电子鼻是否可快速区分处理组/品种并追踪风味变化。</w:t>
       </w:r>
     </w:p>
     <w:p>
@@ -264,7 +264,12 @@
         <w:pStyle w:val="ListBullet"/>
       </w:pPr>
       <w:r>
-        <w:t>风味：挥发性香气物质（GC-MS）及关键风味组分。</w:t>
+        <w:t>风味：电子鼻整体风味指纹（不替代GC-MS）+ 挥发性香气物质（GC-MS）及关键风味组分。</w:t>
+      </w:r>
+    </w:p>
+    <w:p>
+      <w:r>
+        <w:t>电子鼻指标：各传感器响应值、主成分得分、判别准确率。</w:t>
       </w:r>
     </w:p>
     <w:p>
@@ -293,7 +298,7 @@
         <w:pStyle w:val="ListNumber"/>
       </w:pPr>
       <w:r>
-        <w:t>统计方法：双因素方差分析（品种×温度），必要时进行时间点重复测量分析。</w:t>
+        <w:t>统计方法：双因素方差分析（品种×温度），并对电子鼻数据开展PCA/聚类与PLS-DA判别分析；必要时进行时间点重复测量分析。</w:t>
       </w:r>
     </w:p>
     <w:p>
@@ -309,7 +314,7 @@
         <w:pStyle w:val="ListNumber"/>
       </w:pPr>
       <w:r>
-        <w:t>相关性分析：败育率与激素、ROS、酶活、糖淀粉等指标关联分析。</w:t>
+        <w:t>相关性分析：将电子鼻特征与GC-MS关键挥发物、感官评分、糖/淀粉/质构指标联动分析，构建“高温→风味变化”证据链。</w:t>
       </w:r>
     </w:p>
     <w:p>
@@ -349,7 +354,7 @@
         <w:pStyle w:val="ListNumber"/>
       </w:pPr>
       <w:r>
-        <w:t>统一取样部位与编号体系，确保两分流数据可对接。</w:t>
+        <w:t>统一取样部位与编号体系，固定穗位/粒位及样品温控平衡时间；每批次设置空白与标准样，随机化电子鼻测样顺序以降低漂移和批次效应。</w:t>
       </w:r>
     </w:p>
     <w:p>
@@ -479,7 +484,7 @@
       <w:r>
         <w:t>建议按“处理因素 → 生理响应 → 产量形成/品质结果”的路径统一呈现：</w:t>
         <w:br/>
-        <w:t>灌浆期温度处理（CK/HT） → 激素与氧化还原状态变化（ABA、IAA、ZR、GA；O2−、H2O2、MDA；SOD、POD、CAT） → 同化与灌浆过程变化（可溶性糖、蔗糖、还原糖、淀粉及相关酶活） → 结局指标（正常粒率/败育率、百粒重、甜度、质构、风味）。</w:t>
+        <w:t>灌浆期温度处理（CK/HT） → 激素与氧化还原状态变化（ABA、IAA、ZR、GA；O2−、H2O2、MDA；SOD、POD、CAT） → 同化与灌浆过程变化（可溶性糖、蔗糖、还原糖、淀粉及相关酶活） → 品质结局与风味指纹（甜度、质构、电子鼻）→ GC-MS关键挥发物验证。</w:t>
       </w:r>
     </w:p>
     <w:p>
@@ -937,6 +942,68 @@
           </w:p>
         </w:tc>
       </w:tr>
+      <w:tr>
+        <w:tc>
+          <w:tcPr>
+            <w:tcW w:type="dxa" w:w="1440"/>
+          </w:tcPr>
+          <w:p>
+            <w:r>
+              <w:t>品质结果</w:t>
+            </w:r>
+          </w:p>
+        </w:tc>
+        <w:tc>
+          <w:tcPr>
+            <w:tcW w:type="dxa" w:w="1440"/>
+          </w:tcPr>
+          <w:p>
+            <w:r>
+              <w:t>电子鼻响应值（各传感器）、主成分得分、判别准确率</w:t>
+            </w:r>
+          </w:p>
+        </w:tc>
+        <w:tc>
+          <w:tcPr>
+            <w:tcW w:type="dxa" w:w="1440"/>
+          </w:tcPr>
+          <w:p>
+            <w:r>
+              <w:t>相对响应值；得分；%</w:t>
+            </w:r>
+          </w:p>
+        </w:tc>
+        <w:tc>
+          <w:tcPr>
+            <w:tcW w:type="dxa" w:w="1440"/>
+          </w:tcPr>
+          <w:p>
+            <w:r>
+              <w:t>电子鼻检测+多变量统计</w:t>
+            </w:r>
+          </w:p>
+        </w:tc>
+        <w:tc>
+          <w:tcPr>
+            <w:tcW w:type="dxa" w:w="1440"/>
+          </w:tcPr>
+          <w:p>
+            <w:r>
+              <w:t>处理中（0 d、2 d、4 d、7 d）与采收期</w:t>
+            </w:r>
+          </w:p>
+        </w:tc>
+        <w:tc>
+          <w:tcPr>
+            <w:tcW w:type="dxa" w:w="1440"/>
+          </w:tcPr>
+          <w:p>
+            <w:r>
+              <w:t>区分CK/HT、比较品种保质能力、追踪风味变化轨迹</w:t>
+            </w:r>
+          </w:p>
+        </w:tc>
+      </w:tr>
     </w:tbl>
     <w:p>
       <w:pPr>
@@ -948,7 +1015,7 @@
     </w:p>
     <w:p>
       <w:r>
-        <w:t>本研究测定指标体系基于“处理因素—过程响应—结果性状”构建。首先，以灌浆期温度处理（CK/HT）作为驱动因子；其次，围绕高温胁迫下激素平衡、氧化还原稳态及碳同化/灌浆过程设置过程型指标，以揭示籽粒发育受扰动的生理生化机制；最后，以败育分型、粒重及甜度—质构—风味等结局指标评估产量与品质表现。统计分析采用双因素方差分析（品种×温度）及相关性分析，用于验证关键指标间的耦合关系，并支撑“先判败育、再判品质”的分流结论。文中呈现顺序统一为“先图（全局逻辑）→再表（指标细节）→后段落（学术论证）”。</w:t>
+        <w:t>本研究测定指标体系基于“处理因素—过程响应—结果性状”构建。首先，以灌浆期温度处理（CK/HT）作为驱动因子；其次，围绕高温胁迫下激素平衡、氧化还原稳态及碳同化/灌浆过程设置过程型指标，以揭示籽粒发育受扰动的生理生化机制；再次，在品质结果层面将电子鼻用于风味整体指纹的高通量筛查与动态追踪，并以GC-MS对关键挥发物进行验证；最后，以败育分型、粒重及甜度—质构—风味等结局指标评估产量与品质表现。统计分析采用双因素方差分析（品种×温度）、PCA/聚类、PLS-DA及相关性分析，用于验证关键指标间的耦合关系，并支撑“先判败育、再判品质”的分流结论。文中呈现顺序统一为“先图（全局逻辑）→再表（指标细节）→后段落（学术论证）”。</w:t>
       </w:r>
     </w:p>
     <w:sectPr>

</xml_diff>